<commit_message>
Write Excel-valid recalc caches and cap monthly reads.
Store full round-trip numeric caches, map only exact LibreOffice errors, and refuse the rest. Add Word font size and colour, heading and list styles on a blank document, a read cap, profile cleanup, and a Pro recalc cap of 200.

Co-authored-by: LAHutchins91 <LAHutchins91@users.noreply.github.com>
</commit_message>
<xml_diff>
--- a/engine/stetwise/blank/blank.docx
+++ b/engine/stetwise/blank/blank.docx
@@ -26,6 +26,41 @@
 </w:document>
 </file>
 
+<file path=word/numbering.xml><?xml version="1.0" encoding="utf-8"?>
+<w:numbering xmlns:w="http://schemas.openxmlformats.org/wordprocessingml/2006/main">
+  <w:abstractNum w:abstractNumId="0">
+    <w:multiLevelType w:val="hybridMultilevel"/>
+    <w:lvl w:ilvl="0">
+      <w:start w:val="1"/>
+      <w:numFmt w:val="bullet"/>
+      <w:lvlText w:val="•"/>
+      <w:lvlJc w:val="left"/>
+      <w:pPr>
+        <w:ind w:left="720" w:hanging="360"/>
+      </w:pPr>
+    </w:lvl>
+  </w:abstractNum>
+  <w:abstractNum w:abstractNumId="1">
+    <w:multiLevelType w:val="hybridMultilevel"/>
+    <w:lvl w:ilvl="0">
+      <w:start w:val="1"/>
+      <w:numFmt w:val="decimal"/>
+      <w:lvlText w:val="%1."/>
+      <w:lvlJc w:val="left"/>
+      <w:pPr>
+        <w:ind w:left="720" w:hanging="360"/>
+      </w:pPr>
+    </w:lvl>
+  </w:abstractNum>
+  <w:num w:numId="1">
+    <w:abstractNumId w:val="0"/>
+  </w:num>
+  <w:num w:numId="2">
+    <w:abstractNumId w:val="1"/>
+  </w:num>
+</w:numbering>
+</file>
+
 <file path=word/styles.xml><?xml version="1.0" encoding="utf-8"?>
 <w:styles xmlns:w="http://schemas.openxmlformats.org/wordprocessingml/2006/main" xmlns:w14="http://schemas.microsoft.com/office/word/2010/wordml" xmlns:mc="http://schemas.openxmlformats.org/markup-compatibility/2006" mc:Ignorable="w14">
   <w:docDefaults>
@@ -117,6 +152,87 @@
     <w:rPr>
       <w:rFonts w:cs="Noto Sans Devanagari"/>
     </w:rPr>
+  </w:style>
+  <w:style w:type="paragraph" w:styleId="Heading1">
+    <w:name w:val="heading 1"/>
+    <w:basedOn w:val="Normal"/>
+    <w:next w:val="Normal"/>
+    <w:uiPriority w:val="9"/>
+    <w:qFormat/>
+    <w:pPr>
+      <w:keepNext/>
+      <w:keepLines/>
+      <w:spacing w:before="240" w:after="0"/>
+      <w:outlineLvl w:val="0"/>
+    </w:pPr>
+    <w:rPr>
+      <w:b/>
+      <w:bCs/>
+      <w:sz w:val="32"/>
+      <w:szCs w:val="32"/>
+    </w:rPr>
+  </w:style>
+  <w:style w:type="paragraph" w:styleId="Heading2">
+    <w:name w:val="heading 2"/>
+    <w:basedOn w:val="Normal"/>
+    <w:next w:val="Normal"/>
+    <w:uiPriority w:val="9"/>
+    <w:qFormat/>
+    <w:pPr>
+      <w:keepNext/>
+      <w:keepLines/>
+      <w:spacing w:before="200" w:after="0"/>
+      <w:outlineLvl w:val="1"/>
+    </w:pPr>
+    <w:rPr>
+      <w:b/>
+      <w:bCs/>
+      <w:sz w:val="26"/>
+      <w:szCs w:val="26"/>
+    </w:rPr>
+  </w:style>
+  <w:style w:type="paragraph" w:styleId="Heading3">
+    <w:name w:val="heading 3"/>
+    <w:basedOn w:val="Normal"/>
+    <w:next w:val="Normal"/>
+    <w:uiPriority w:val="9"/>
+    <w:qFormat/>
+    <w:pPr>
+      <w:keepNext/>
+      <w:keepLines/>
+      <w:spacing w:before="160" w:after="0"/>
+      <w:outlineLvl w:val="2"/>
+    </w:pPr>
+    <w:rPr>
+      <w:b/>
+      <w:bCs/>
+      <w:sz w:val="24"/>
+      <w:szCs w:val="24"/>
+    </w:rPr>
+  </w:style>
+  <w:style w:type="paragraph" w:styleId="ListBullet">
+    <w:name w:val="List Bullet"/>
+    <w:basedOn w:val="Normal"/>
+    <w:uiPriority w:val="99"/>
+    <w:pPr>
+      <w:numPr>
+        <w:ilvl w:val="0"/>
+        <w:numId w:val="1"/>
+      </w:numPr>
+      <w:contextualSpacing/>
+    </w:pPr>
+  </w:style>
+  <w:style w:type="paragraph" w:styleId="ListNumber">
+    <w:name w:val="List Number"/>
+    <w:basedOn w:val="Normal"/>
+    <w:uiPriority w:val="99"/>
+    <w:pPr>
+      <w:numPr>
+        <w:ilvl w:val="0"/>
+        <w:numId w:val="2"/>
+      </w:numPr>
+      <w:contextualSpacing/>
+    </w:pPr>
   </w:style>
 </w:styles>
 </file>

</xml_diff>